<commit_message>
VPS-V4: Gemini 2.5 の thinking を無効化(thinkingBudget:0)。推論文の混入を防止
Co-Authored-By: Claude Opus 4.8 <noreply@anthropic.com>
</commit_message>
<xml_diff>
--- a/Sampledata/テールスケール設定/設定／テールスケール.docx
+++ b/Sampledata/テールスケール設定/設定／テールスケール.docx
@@ -60,17 +60,97 @@
     <w:p>
       <w:pPr>
         <w:rPr>
-          <w:rFonts w:hint="eastAsia"/>
-        </w:rPr>
-      </w:pPr>
-      <w:r>
-        <w:rPr>
           <w:rFonts w:ascii="Roboto" w:hAnsi="Roboto"/>
           <w:color w:val="444746"/>
           <w:szCs w:val="21"/>
           <w:shd w:val="clear" w:color="auto" w:fill="FFFFFF"/>
         </w:rPr>
+      </w:pPr>
+      <w:r>
+        <w:rPr>
+          <w:rFonts w:ascii="Roboto" w:hAnsi="Roboto"/>
+          <w:color w:val="444746"/>
+          <w:szCs w:val="21"/>
+          <w:shd w:val="clear" w:color="auto" w:fill="FFFFFF"/>
+        </w:rPr>
         <w:t>ec2c331eaa6e443f9364d50153cfb2cf4ecd64bd52bb4fe1ba11c05be00b0b14</w:t>
+      </w:r>
+    </w:p>
+    <w:p>
+      <w:pPr>
+        <w:rPr>
+          <w:rFonts w:ascii="Roboto" w:hAnsi="Roboto"/>
+          <w:color w:val="444746"/>
+          <w:szCs w:val="21"/>
+          <w:shd w:val="clear" w:color="auto" w:fill="FFFFFF"/>
+        </w:rPr>
+      </w:pPr>
+    </w:p>
+    <w:p>
+      <w:pPr>
+        <w:rPr>
+          <w:rFonts w:ascii="Roboto" w:hAnsi="Roboto"/>
+          <w:color w:val="444746"/>
+          <w:szCs w:val="21"/>
+          <w:shd w:val="clear" w:color="auto" w:fill="FFFFFF"/>
+        </w:rPr>
+      </w:pPr>
+    </w:p>
+    <w:p>
+      <w:pPr>
+        <w:rPr>
+          <w:rFonts w:ascii="Roboto" w:hAnsi="Roboto"/>
+          <w:color w:val="444746"/>
+          <w:szCs w:val="21"/>
+          <w:shd w:val="clear" w:color="auto" w:fill="FFFFFF"/>
+        </w:rPr>
+      </w:pPr>
+      <w:r>
+        <w:rPr>
+          <w:rFonts w:ascii="Roboto" w:hAnsi="Roboto"/>
+          <w:color w:val="444746"/>
+          <w:szCs w:val="21"/>
+          <w:shd w:val="clear" w:color="auto" w:fill="FFFFFF"/>
+        </w:rPr>
+        <w:t xml:space="preserve">Google Console OAuth </w:t>
+      </w:r>
+      <w:r>
+        <w:rPr>
+          <w:rFonts w:ascii="Roboto" w:hAnsi="Roboto"/>
+          <w:color w:val="444746"/>
+          <w:szCs w:val="21"/>
+          <w:shd w:val="clear" w:color="auto" w:fill="FFFFFF"/>
+        </w:rPr>
+        <w:t>クライアント</w:t>
+      </w:r>
+      <w:r>
+        <w:rPr>
+          <w:rFonts w:ascii="Roboto" w:hAnsi="Roboto"/>
+          <w:color w:val="444746"/>
+          <w:szCs w:val="21"/>
+          <w:shd w:val="clear" w:color="auto" w:fill="FFFFFF"/>
+        </w:rPr>
+        <w:t xml:space="preserve"> ID</w:t>
+      </w:r>
+    </w:p>
+    <w:p>
+      <w:r>
+        <w:t>253269323289-50jcp0vld3uunv1goma6tmlp9q70eidk.apps.googleusercontent.com</w:t>
+      </w:r>
+    </w:p>
+    <w:p>
+      <w:r>
+        <w:t>クライアントシークレット</w:t>
+      </w:r>
+    </w:p>
+    <w:p>
+      <w:pPr>
+        <w:rPr>
+          <w:rFonts w:hint="eastAsia"/>
+        </w:rPr>
+      </w:pPr>
+      <w:r>
+        <w:t>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</w:t>
       </w:r>
     </w:p>
     <w:sectPr>

</xml_diff>